<commit_message>
Focus project analyst CV on coordination and delivery outcomes
</commit_message>
<xml_diff>
--- a/tailored-cvs/04_DHL_Project_Analyst.docx
+++ b/tailored-cvs/04_DHL_Project_Analyst.docx
@@ -194,7 +194,7 @@
         <w:ind w:left="173" w:hanging="144"/>
       </w:pPr>
       <w:r>
-        <w:t>• Coordinated deadlines, meetings and review sessions using Gmail, Zoom and WhatsApp; created Zapier reminders to support team organization.</w:t>
+        <w:t>• Coordinated deadlines, task follow-ups and review meetings for a six-person team; used Zapier reminders to address missed responses and keep delivery on schedule.</w:t>
       </w:r>
     </w:p>
     <w:p>
@@ -203,7 +203,7 @@
         <w:ind w:left="173" w:hanging="144"/>
       </w:pPr>
       <w:r>
-        <w:t>• Proposed the product solution, incorporated team feedback and rehearsed the final presentation; documented collaboration challenges and improvements in a reflective report.</w:t>
+        <w:t>• Proposed the product solution, incorporated team feedback and organized presentation rehearsals; the team delivered its report and pitch within the assignment timeline.</w:t>
       </w:r>
     </w:p>
     <w:p>

</xml_diff>